<commit_message>
finish parallel systems i hop
</commit_message>
<xml_diff>
--- a/Parallel Systems/Exam perparation/Exam Questions with code.docx
+++ b/Parallel Systems/Exam perparation/Exam Questions with code.docx
@@ -7709,19 +7709,11 @@
         </w:rPr>
         <w:t xml:space="preserve"> </w:t>
       </w:r>
-      <w:proofErr w:type="gramStart"/>
-      <w:r>
-        <w:rPr>
-          <w:color w:val="000000" w:themeColor="text1"/>
-        </w:rPr>
-        <w:t>A</w:t>
-      </w:r>
-      <w:proofErr w:type="gramEnd"/>
-      <w:r>
-        <w:rPr>
-          <w:color w:val="000000" w:themeColor="text1"/>
-        </w:rPr>
-        <w:t xml:space="preserve"> coroutine contains the </w:t>
+      <w:r>
+        <w:rPr>
+          <w:color w:val="000000" w:themeColor="text1"/>
+        </w:rPr>
+        <w:t xml:space="preserve">A coroutine contains the </w:t>
       </w:r>
       <w:proofErr w:type="gramStart"/>
       <w:r>
@@ -11500,14 +11492,39 @@
           <w:szCs w:val="24"/>
         </w:rPr>
       </w:pPr>
-      <w:r>
-        <w:rPr>
-          <w:b/>
-          <w:bCs/>
-          <w:color w:val="000000" w:themeColor="text1"/>
-          <w:sz w:val="24"/>
-          <w:szCs w:val="24"/>
-        </w:rPr>
+    </w:p>
+    <w:p>
+      <w:pPr>
+        <w:jc w:val="both"/>
+        <w:rPr>
+          <w:b/>
+          <w:bCs/>
+          <w:color w:val="000000" w:themeColor="text1"/>
+          <w:sz w:val="24"/>
+          <w:szCs w:val="24"/>
+        </w:rPr>
+      </w:pPr>
+    </w:p>
+    <w:p>
+      <w:pPr>
+        <w:jc w:val="both"/>
+        <w:rPr>
+          <w:b/>
+          <w:bCs/>
+          <w:color w:val="000000" w:themeColor="text1"/>
+          <w:sz w:val="24"/>
+          <w:szCs w:val="24"/>
+        </w:rPr>
+      </w:pPr>
+      <w:r>
+        <w:rPr>
+          <w:b/>
+          <w:bCs/>
+          <w:color w:val="000000" w:themeColor="text1"/>
+          <w:sz w:val="24"/>
+          <w:szCs w:val="24"/>
+        </w:rPr>
+        <w:lastRenderedPageBreak/>
         <w:t>▪</w:t>
       </w:r>
       <w:r>
@@ -11564,7 +11581,6 @@
         <w:rPr>
           <w:color w:val="000000" w:themeColor="text1"/>
         </w:rPr>
-        <w:lastRenderedPageBreak/>
         <w:t xml:space="preserve">Cores can have independent fetch/decode units. </w:t>
       </w:r>
     </w:p>

</xml_diff>